<commit_message>
docs: make English README the default, complete missing sections
- Swap README.md (now English) and README_CN.md (now Chinese)
- GitHub repo landing page now displays the English version
- Add missing sections to English README for full parity with Chinese:
  - Quick Preview section with feature list and performance summary
  - Directory Structure with English annotations
  - Environment Requirements under Verification
  - Draw.io/Visio vector diagram recommendation note
- Update cross-links between both README files

Co-Authored-By: Claude Opus 4.6 <noreply@anthropic.com>
</commit_message>
<xml_diff>
--- a/答辩材料/CICC0900784 中科芯杯 快速预览页.docx
+++ b/答辩材料/CICC0900784 中科芯杯 快速预览页.docx
@@ -1,6 +1,6 @@
 
 <file path=word/document.xml><?xml version="1.0" encoding="utf-8"?>
-<w:document xmlns:wpc="http://schemas.microsoft.com/office/word/2010/wordprocessingCanvas" xmlns:cx="http://schemas.microsoft.com/office/drawing/2014/chartex" xmlns:cx1="http://schemas.microsoft.com/office/drawing/2015/9/8/chartex" xmlns:cx2="http://schemas.microsoft.com/office/drawing/2015/10/21/chartex" xmlns:cx3="http://schemas.microsoft.com/office/drawing/2016/5/9/chartex" xmlns:cx4="http://schemas.microsoft.com/office/drawing/2016/5/10/chartex" xmlns:cx5="http://schemas.microsoft.com/office/drawing/2016/5/11/chartex" xmlns:cx6="http://schemas.microsoft.com/office/drawing/2016/5/12/chartex" xmlns:cx7="http://schemas.microsoft.com/office/drawing/2016/5/13/chartex" xmlns:cx8="http://schemas.microsoft.com/office/drawing/2016/5/14/chartex" xmlns:mc="http://schemas.openxmlformats.org/markup-compatibility/2006" xmlns:aink="http://schemas.microsoft.com/office/drawing/2016/ink" xmlns:am3d="http://schemas.microsoft.com/office/drawing/2017/model3d" xmlns:o="urn:schemas-microsoft-com:office:office" xmlns:r="http://schemas.openxmlformats.org/officeDocument/2006/relationships" xmlns:m="http://schemas.openxmlformats.org/officeDocument/2006/math" xmlns:v="urn:schemas-microsoft-com:vml" xmlns:wp14="http://schemas.microsoft.com/office/word/2010/wordprocessingDrawing" xmlns:wp="http://schemas.openxmlformats.org/drawingml/2006/wordprocessingDrawing" xmlns:w10="urn:schemas-microsoft-com:office:word" xmlns:w="http://schemas.openxmlformats.org/wordprocessingml/2006/main" xmlns:w14="http://schemas.microsoft.com/office/word/2010/wordml" xmlns:w15="http://schemas.microsoft.com/office/word/2012/wordml" xmlns:w16cex="http://schemas.microsoft.com/office/word/2018/wordml/cex" xmlns:w16cid="http://schemas.microsoft.com/office/word/2016/wordml/cid" xmlns:w16="http://schemas.microsoft.com/office/word/2018/wordml" xmlns:w16sdtdh="http://schemas.microsoft.com/office/word/2020/wordml/sdtdatahash" xmlns:w16se="http://schemas.microsoft.com/office/word/2015/wordml/symex" xmlns:wpg="http://schemas.microsoft.com/office/word/2010/wordprocessingGroup" xmlns:wpi="http://schemas.microsoft.com/office/word/2010/wordprocessingInk" xmlns:wne="http://schemas.microsoft.com/office/word/2006/wordml" xmlns:wps="http://schemas.microsoft.com/office/word/2010/wordprocessingShape" mc:Ignorable="w14 w15 w16se w16cid w16 w16cex w16sdtdh wp14">
+<w:document xmlns:wpc="http://schemas.microsoft.com/office/word/2010/wordprocessingCanvas" xmlns:cx="http://schemas.microsoft.com/office/drawing/2014/chartex" xmlns:cx1="http://schemas.microsoft.com/office/drawing/2015/9/8/chartex" xmlns:cx2="http://schemas.microsoft.com/office/drawing/2015/10/21/chartex" xmlns:cx3="http://schemas.microsoft.com/office/drawing/2016/5/9/chartex" xmlns:cx4="http://schemas.microsoft.com/office/drawing/2016/5/10/chartex" xmlns:cx5="http://schemas.microsoft.com/office/drawing/2016/5/11/chartex" xmlns:cx6="http://schemas.microsoft.com/office/drawing/2016/5/12/chartex" xmlns:cx7="http://schemas.microsoft.com/office/drawing/2016/5/13/chartex" xmlns:cx8="http://schemas.microsoft.com/office/drawing/2016/5/14/chartex" xmlns:mc="http://schemas.openxmlformats.org/markup-compatibility/2006" xmlns:aink="http://schemas.microsoft.com/office/drawing/2016/ink" xmlns:am3d="http://schemas.microsoft.com/office/drawing/2017/model3d" xmlns:o="urn:schemas-microsoft-com:office:office" xmlns:oel="http://schemas.microsoft.com/office/2019/extlst" xmlns:r="http://schemas.openxmlformats.org/officeDocument/2006/relationships" xmlns:m="http://schemas.openxmlformats.org/officeDocument/2006/math" xmlns:v="urn:schemas-microsoft-com:vml" xmlns:wp14="http://schemas.microsoft.com/office/word/2010/wordprocessingDrawing" xmlns:wp="http://schemas.openxmlformats.org/drawingml/2006/wordprocessingDrawing" xmlns:w10="urn:schemas-microsoft-com:office:word" xmlns:w="http://schemas.openxmlformats.org/wordprocessingml/2006/main" xmlns:w14="http://schemas.microsoft.com/office/word/2010/wordml" xmlns:w15="http://schemas.microsoft.com/office/word/2012/wordml" xmlns:w16cex="http://schemas.microsoft.com/office/word/2018/wordml/cex" xmlns:w16cid="http://schemas.microsoft.com/office/word/2016/wordml/cid" xmlns:w16="http://schemas.microsoft.com/office/word/2018/wordml" xmlns:w16du="http://schemas.microsoft.com/office/word/2023/wordml/word16du" xmlns:w16sdtdh="http://schemas.microsoft.com/office/word/2020/wordml/sdtdatahash" xmlns:w16sdtfl="http://schemas.microsoft.com/office/word/2024/wordml/sdtformatlock" xmlns:w16se="http://schemas.microsoft.com/office/word/2015/wordml/symex" xmlns:wpg="http://schemas.microsoft.com/office/word/2010/wordprocessingGroup" xmlns:wpi="http://schemas.microsoft.com/office/word/2010/wordprocessingInk" xmlns:wne="http://schemas.microsoft.com/office/word/2006/wordml" xmlns:wps="http://schemas.microsoft.com/office/word/2010/wordprocessingShape" mc:Ignorable="w14 w15 w16se w16cid w16 w16cex w16sdtdh w16sdtfl w16du wp14">
   <w:body>
     <w:p>
       <w:pPr>
@@ -8,7 +8,7 @@
         <w:spacing w:line="240" w:lineRule="auto"/>
         <w:jc w:val="center"/>
         <w:rPr>
-          <w:rFonts w:ascii="黑体" w:eastAsia="黑体" w:hAnsi="黑体" w:cs="黑体"/>
+          <w:rFonts w:ascii="SimHei" w:eastAsia="SimHei" w:hAnsi="SimHei" w:cs="SimHei" w:hint="eastAsia"/>
           <w:sz w:val="32"/>
           <w:szCs w:val="32"/>
         </w:rPr>
@@ -17,7 +17,7 @@
       <w:bookmarkStart w:id="1" w:name="_Toc203507097"/>
       <w:r>
         <w:rPr>
-          <w:rFonts w:ascii="黑体" w:eastAsia="黑体" w:hAnsi="黑体" w:cs="黑体" w:hint="eastAsia"/>
+          <w:rFonts w:ascii="SimHei" w:eastAsia="SimHei" w:hAnsi="SimHei" w:cs="SimHei" w:hint="eastAsia"/>
           <w:sz w:val="32"/>
           <w:szCs w:val="32"/>
         </w:rPr>
@@ -27,7 +27,7 @@
       <w:bookmarkEnd w:id="1"/>
       <w:r>
         <w:rPr>
-          <w:rFonts w:ascii="黑体" w:eastAsia="黑体" w:hAnsi="黑体" w:cs="黑体" w:hint="eastAsia"/>
+          <w:rFonts w:ascii="SimHei" w:eastAsia="SimHei" w:hAnsi="SimHei" w:cs="SimHei" w:hint="eastAsia"/>
           <w:sz w:val="32"/>
           <w:szCs w:val="32"/>
         </w:rPr>
@@ -45,14 +45,13 @@
         <w:ind w:firstLineChars="0"/>
         <w:jc w:val="right"/>
         <w:rPr>
-          <w:rFonts w:hint="eastAsia"/>
           <w:sz w:val="21"/>
           <w:szCs w:val="21"/>
         </w:rPr>
       </w:pPr>
       <w:r>
         <w:rPr>
-          <w:rFonts w:ascii="黑体" w:eastAsia="黑体" w:hAnsi="黑体" w:cs="黑体" w:hint="eastAsia"/>
+          <w:rFonts w:ascii="SimHei" w:eastAsia="SimHei" w:hAnsi="SimHei" w:cs="SimHei" w:hint="eastAsia"/>
           <w:b/>
           <w:bCs/>
           <w:kern w:val="44"/>
@@ -61,7 +60,7 @@
       </w:r>
       <w:r>
         <w:rPr>
-          <w:rFonts w:ascii="黑体" w:eastAsia="黑体" w:hAnsi="黑体" w:cs="黑体"/>
+          <w:rFonts w:ascii="SimHei" w:eastAsia="SimHei" w:hAnsi="SimHei" w:cs="SimHei"/>
           <w:b/>
           <w:bCs/>
           <w:kern w:val="44"/>
@@ -70,7 +69,7 @@
       </w:r>
       <w:r>
         <w:rPr>
-          <w:rFonts w:ascii="黑体" w:eastAsia="黑体" w:hAnsi="黑体" w:cs="黑体" w:hint="eastAsia"/>
+          <w:rFonts w:ascii="SimHei" w:eastAsia="SimHei" w:hAnsi="SimHei" w:cs="SimHei" w:hint="eastAsia"/>
           <w:b/>
           <w:bCs/>
           <w:kern w:val="44"/>
@@ -88,7 +87,7 @@
         <w:spacing w:afterLines="50" w:after="163" w:line="240" w:lineRule="auto"/>
         <w:ind w:firstLineChars="0"/>
         <w:rPr>
-          <w:rFonts w:ascii="黑体" w:eastAsia="黑体" w:hAnsi="黑体"/>
+          <w:rFonts w:ascii="SimHei" w:eastAsia="SimHei" w:hAnsi="SimHei" w:hint="eastAsia"/>
           <w:b/>
           <w:bCs/>
           <w:sz w:val="28"/>
@@ -97,7 +96,7 @@
       </w:pPr>
       <w:r>
         <w:rPr>
-          <w:rFonts w:ascii="黑体" w:eastAsia="黑体" w:hAnsi="黑体" w:hint="eastAsia"/>
+          <w:rFonts w:ascii="SimHei" w:eastAsia="SimHei" w:hAnsi="SimHei" w:hint="eastAsia"/>
           <w:b/>
           <w:bCs/>
           <w:sz w:val="28"/>
@@ -110,7 +109,7 @@
       <w:pPr>
         <w:spacing w:afterLines="50" w:after="163"/>
         <w:rPr>
-          <w:rFonts w:ascii="黑体" w:eastAsia="黑体" w:hAnsi="黑体" w:hint="eastAsia"/>
+          <w:rFonts w:ascii="SimHei" w:eastAsia="SimHei" w:hAnsi="SimHei" w:hint="eastAsia"/>
           <w:b/>
           <w:bCs/>
           <w:sz w:val="28"/>
@@ -119,9 +118,10 @@
       </w:pPr>
       <w:r>
         <w:rPr>
-          <w:rFonts w:ascii="黑体" w:eastAsia="黑体" w:hAnsi="黑体"/>
+          <w:rFonts w:ascii="SimHei" w:eastAsia="SimHei" w:hAnsi="SimHei"/>
           <w:b/>
           <w:bCs/>
+          <w:noProof/>
           <w:sz w:val="28"/>
           <w:szCs w:val="28"/>
         </w:rPr>
@@ -174,7 +174,7 @@
         <w:ind w:firstLineChars="0"/>
         <w:jc w:val="left"/>
         <w:rPr>
-          <w:rFonts w:ascii="黑体" w:eastAsia="黑体" w:hAnsi="黑体" w:cs="Times New Roman"/>
+          <w:rFonts w:ascii="SimHei" w:eastAsia="SimHei" w:hAnsi="SimHei" w:cs="Times New Roman" w:hint="eastAsia"/>
           <w:b/>
           <w:bCs/>
           <w:kern w:val="0"/>
@@ -184,7 +184,7 @@
       </w:pPr>
       <w:r>
         <w:rPr>
-          <w:rFonts w:ascii="黑体" w:eastAsia="黑体" w:hAnsi="黑体" w:cs="Times New Roman" w:hint="eastAsia"/>
+          <w:rFonts w:ascii="SimHei" w:eastAsia="SimHei" w:hAnsi="SimHei" w:cs="Times New Roman" w:hint="eastAsia"/>
           <w:b/>
           <w:bCs/>
           <w:kern w:val="0"/>
@@ -232,7 +232,6 @@
               <w:spacing w:afterLines="50" w:after="163"/>
               <w:jc w:val="center"/>
               <w:rPr>
-                <w:rFonts w:hint="eastAsia"/>
                 <w:b/>
                 <w:sz w:val="28"/>
                 <w:szCs w:val="28"/>
@@ -642,7 +641,6 @@
               <w:spacing w:afterLines="50" w:after="163"/>
               <w:jc w:val="center"/>
               <w:rPr>
-                <w:rFonts w:hint="eastAsia"/>
                 <w:b/>
                 <w:color w:val="000000"/>
               </w:rPr>
@@ -671,7 +669,6 @@
             <w:pPr>
               <w:jc w:val="left"/>
               <w:rPr>
-                <w:rFonts w:hint="eastAsia"/>
                 <w:color w:val="000000"/>
               </w:rPr>
             </w:pPr>
@@ -981,7 +978,7 @@
       <w:pPr>
         <w:spacing w:beforeLines="50" w:before="163" w:afterLines="50" w:after="163"/>
         <w:rPr>
-          <w:rFonts w:ascii="黑体" w:eastAsia="黑体" w:hAnsi="黑体"/>
+          <w:rFonts w:ascii="SimHei" w:eastAsia="SimHei" w:hAnsi="SimHei" w:hint="eastAsia"/>
           <w:b/>
           <w:bCs/>
           <w:sz w:val="28"/>
@@ -993,7 +990,7 @@
       <w:pPr>
         <w:spacing w:beforeLines="50" w:before="163" w:afterLines="50" w:after="163"/>
         <w:rPr>
-          <w:rFonts w:ascii="黑体" w:eastAsia="黑体" w:hAnsi="黑体"/>
+          <w:rFonts w:ascii="SimHei" w:eastAsia="SimHei" w:hAnsi="SimHei" w:hint="eastAsia"/>
           <w:b/>
           <w:bCs/>
           <w:sz w:val="28"/>
@@ -1002,7 +999,7 @@
       </w:pPr>
       <w:r>
         <w:rPr>
-          <w:rFonts w:ascii="黑体" w:eastAsia="黑体" w:hAnsi="黑体" w:hint="eastAsia"/>
+          <w:rFonts w:ascii="SimHei" w:eastAsia="SimHei" w:hAnsi="SimHei" w:hint="eastAsia"/>
           <w:b/>
           <w:bCs/>
           <w:sz w:val="28"/>
@@ -1013,7 +1010,7 @@
       </w:r>
       <w:r>
         <w:rPr>
-          <w:rFonts w:ascii="黑体" w:eastAsia="黑体" w:hAnsi="黑体" w:hint="eastAsia"/>
+          <w:rFonts w:ascii="SimHei" w:eastAsia="SimHei" w:hAnsi="SimHei" w:hint="eastAsia"/>
           <w:b/>
           <w:bCs/>
           <w:sz w:val="28"/>
@@ -1054,7 +1051,7 @@
               </w:numPr>
               <w:spacing w:afterLines="50" w:after="163"/>
               <w:rPr>
-                <w:rFonts w:eastAsiaTheme="minorEastAsia" w:hint="eastAsia"/>
+                <w:rFonts w:eastAsiaTheme="minorEastAsia"/>
                 <w:b/>
                 <w:bCs/>
                 <w:sz w:val="28"/>
@@ -1098,9 +1095,9 @@
                 <w:noProof/>
               </w:rPr>
               <w:drawing>
-                <wp:inline distT="0" distB="0" distL="0" distR="0" wp14:anchorId="449982BA" wp14:editId="7067D491">
-                  <wp:extent cx="2945765" cy="1552575"/>
-                  <wp:effectExtent l="0" t="0" r="6985" b="9525"/>
+                <wp:inline distT="0" distB="0" distL="0" distR="0" wp14:anchorId="449982BA" wp14:editId="5DF3C5BB">
+                  <wp:extent cx="4486887" cy="2364828"/>
+                  <wp:effectExtent l="0" t="0" r="9525" b="0"/>
                   <wp:docPr id="7" name="图片 7"/>
                   <wp:cNvGraphicFramePr>
                     <a:graphicFrameLocks xmlns:a="http://schemas.openxmlformats.org/drawingml/2006/main" noChangeAspect="1"/>
@@ -1130,7 +1127,7 @@
                         <pic:spPr bwMode="auto">
                           <a:xfrm>
                             <a:off x="0" y="0"/>
-                            <a:ext cx="2945765" cy="1552575"/>
+                            <a:ext cx="4509848" cy="2376930"/>
                           </a:xfrm>
                           <a:prstGeom prst="rect">
                             <a:avLst/>
@@ -1235,9 +1232,9 @@
                 <w:noProof/>
               </w:rPr>
               <w:drawing>
-                <wp:inline distT="0" distB="0" distL="0" distR="0" wp14:anchorId="503902B2" wp14:editId="23F83510">
-                  <wp:extent cx="1525270" cy="1435735"/>
-                  <wp:effectExtent l="0" t="0" r="0" b="0"/>
+                <wp:inline distT="0" distB="0" distL="0" distR="0" wp14:anchorId="503902B2" wp14:editId="323DF4FD">
+                  <wp:extent cx="3216165" cy="3027372"/>
+                  <wp:effectExtent l="0" t="0" r="3810" b="1905"/>
                   <wp:docPr id="6" name="图片 6"/>
                   <wp:cNvGraphicFramePr>
                     <a:graphicFrameLocks xmlns:a="http://schemas.openxmlformats.org/drawingml/2006/main" noChangeAspect="1"/>
@@ -1267,7 +1264,7 @@
                         <pic:spPr bwMode="auto">
                           <a:xfrm>
                             <a:off x="0" y="0"/>
-                            <a:ext cx="1525270" cy="1435735"/>
+                            <a:ext cx="3238291" cy="3048199"/>
                           </a:xfrm>
                           <a:prstGeom prst="rect">
                             <a:avLst/>
@@ -1365,9 +1362,9 @@
                 <w:noProof/>
               </w:rPr>
               <w:drawing>
-                <wp:inline distT="0" distB="0" distL="0" distR="0" wp14:anchorId="36293A6F" wp14:editId="78063304">
-                  <wp:extent cx="4058285" cy="1486535"/>
-                  <wp:effectExtent l="0" t="0" r="0" b="0"/>
+                <wp:inline distT="0" distB="0" distL="0" distR="0" wp14:anchorId="36293A6F" wp14:editId="2A21DBDB">
+                  <wp:extent cx="4506381" cy="1650671"/>
+                  <wp:effectExtent l="0" t="0" r="8890" b="6985"/>
                   <wp:docPr id="5" name="图片 5"/>
                   <wp:cNvGraphicFramePr>
                     <a:graphicFrameLocks xmlns:a="http://schemas.openxmlformats.org/drawingml/2006/main" noChangeAspect="1"/>
@@ -1397,7 +1394,7 @@
                         <pic:spPr bwMode="auto">
                           <a:xfrm>
                             <a:off x="0" y="0"/>
-                            <a:ext cx="4058285" cy="1486535"/>
+                            <a:ext cx="4523791" cy="1657048"/>
                           </a:xfrm>
                           <a:prstGeom prst="rect">
                             <a:avLst/>
@@ -1445,6 +1442,7 @@
                 <w:sz w:val="28"/>
                 <w:szCs w:val="28"/>
               </w:rPr>
+              <w:lastRenderedPageBreak/>
               <w:t xml:space="preserve">4. </w:t>
             </w:r>
             <w:r>
@@ -1561,13 +1559,14 @@
               <w:rPr>
                 <w:b/>
                 <w:bCs/>
+                <w:noProof/>
                 <w:sz w:val="28"/>
                 <w:szCs w:val="28"/>
               </w:rPr>
               <w:drawing>
-                <wp:inline distT="0" distB="0" distL="0" distR="0" wp14:anchorId="117798C9" wp14:editId="342D1CA1">
-                  <wp:extent cx="3664139" cy="1681097"/>
-                  <wp:effectExtent l="0" t="0" r="0" b="0"/>
+                <wp:inline distT="0" distB="0" distL="0" distR="0" wp14:anchorId="117798C9" wp14:editId="5B36DBE1">
+                  <wp:extent cx="4570239" cy="2096813"/>
+                  <wp:effectExtent l="0" t="0" r="1905" b="0"/>
                   <wp:docPr id="11" name="图片 10">
                     <a:extLst xmlns:a="http://schemas.openxmlformats.org/drawingml/2006/main">
                       <a:ext uri="{FF2B5EF4-FFF2-40B4-BE49-F238E27FC236}">
@@ -1602,7 +1601,7 @@
                         <pic:spPr>
                           <a:xfrm>
                             <a:off x="0" y="0"/>
-                            <a:ext cx="3664139" cy="1681097"/>
+                            <a:ext cx="4576943" cy="2099889"/>
                           </a:xfrm>
                           <a:prstGeom prst="rect">
                             <a:avLst/>
@@ -1620,7 +1619,6 @@
               <w:spacing w:beforeLines="50" w:before="163" w:afterLines="50" w:after="163"/>
               <w:jc w:val="center"/>
               <w:rPr>
-                <w:rFonts w:hint="eastAsia"/>
                 <w:b/>
                 <w:bCs/>
                 <w:sz w:val="28"/>
@@ -1631,12 +1629,12 @@
               <w:rPr>
                 <w:b/>
                 <w:bCs/>
+                <w:noProof/>
                 <w:sz w:val="28"/>
                 <w:szCs w:val="28"/>
               </w:rPr>
-              <w:lastRenderedPageBreak/>
               <w:drawing>
-                <wp:inline distT="0" distB="0" distL="0" distR="0" wp14:anchorId="24C3E4CD" wp14:editId="0A2D5156">
+                <wp:inline distT="0" distB="0" distL="0" distR="0" wp14:anchorId="24C3E4CD" wp14:editId="3D212632">
                   <wp:extent cx="4520565" cy="2346960"/>
                   <wp:effectExtent l="0" t="0" r="0" b="0"/>
                   <wp:docPr id="9" name="图片 4">
@@ -1673,7 +1671,7 @@
                         <pic:spPr>
                           <a:xfrm>
                             <a:off x="0" y="0"/>
-                            <a:ext cx="4520565" cy="2346960"/>
+                            <a:ext cx="4524458" cy="2348981"/>
                           </a:xfrm>
                           <a:prstGeom prst="rect">
                             <a:avLst/>
@@ -1705,8 +1703,8 @@
                 <w:szCs w:val="28"/>
               </w:rPr>
               <w:drawing>
-                <wp:inline distT="0" distB="0" distL="0" distR="0" wp14:anchorId="40B1BA20" wp14:editId="7B2E5E89">
-                  <wp:extent cx="4260215" cy="1643569"/>
+                <wp:inline distT="0" distB="0" distL="0" distR="0" wp14:anchorId="40B1BA20" wp14:editId="6DA61CC7">
+                  <wp:extent cx="4412798" cy="1702435"/>
                   <wp:effectExtent l="0" t="0" r="6985" b="0"/>
                   <wp:docPr id="1" name="图片 1"/>
                   <wp:cNvGraphicFramePr>
@@ -1737,7 +1735,7 @@
                         <pic:spPr bwMode="auto">
                           <a:xfrm>
                             <a:off x="0" y="0"/>
-                            <a:ext cx="4284049" cy="1652764"/>
+                            <a:ext cx="4448641" cy="1716263"/>
                           </a:xfrm>
                           <a:prstGeom prst="rect">
                             <a:avLst/>
@@ -1761,7 +1759,7 @@
       <w:pPr>
         <w:spacing w:beforeLines="50" w:before="163" w:afterLines="50" w:after="163"/>
         <w:rPr>
-          <w:rFonts w:ascii="黑体" w:eastAsia="黑体" w:hAnsi="黑体"/>
+          <w:rFonts w:ascii="SimHei" w:eastAsia="SimHei" w:hAnsi="SimHei" w:hint="eastAsia"/>
           <w:b/>
           <w:bCs/>
           <w:sz w:val="28"/>
@@ -1770,18 +1768,17 @@
       </w:pPr>
       <w:r>
         <w:rPr>
-          <w:rFonts w:ascii="黑体" w:eastAsia="黑体" w:hAnsi="黑体" w:hint="eastAsia"/>
+          <w:rFonts w:ascii="SimHei" w:eastAsia="SimHei" w:hAnsi="SimHei" w:hint="eastAsia"/>
           <w:b/>
           <w:bCs/>
           <w:sz w:val="28"/>
           <w:szCs w:val="28"/>
         </w:rPr>
-        <w:lastRenderedPageBreak/>
         <w:t>四</w:t>
       </w:r>
       <w:r>
         <w:rPr>
-          <w:rFonts w:ascii="黑体" w:eastAsia="黑体" w:hAnsi="黑体" w:hint="eastAsia"/>
+          <w:rFonts w:ascii="SimHei" w:eastAsia="SimHei" w:hAnsi="SimHei" w:hint="eastAsia"/>
           <w:b/>
           <w:bCs/>
           <w:sz w:val="28"/>
@@ -1836,7 +1833,7 @@
 </file>
 
 <file path=word/numbering.xml><?xml version="1.0" encoding="utf-8"?>
-<w:numbering xmlns:wpc="http://schemas.microsoft.com/office/word/2010/wordprocessingCanvas" xmlns:cx="http://schemas.microsoft.com/office/drawing/2014/chartex" xmlns:cx1="http://schemas.microsoft.com/office/drawing/2015/9/8/chartex" xmlns:cx2="http://schemas.microsoft.com/office/drawing/2015/10/21/chartex" xmlns:cx3="http://schemas.microsoft.com/office/drawing/2016/5/9/chartex" xmlns:cx4="http://schemas.microsoft.com/office/drawing/2016/5/10/chartex" xmlns:cx5="http://schemas.microsoft.com/office/drawing/2016/5/11/chartex" xmlns:cx6="http://schemas.microsoft.com/office/drawing/2016/5/12/chartex" xmlns:cx7="http://schemas.microsoft.com/office/drawing/2016/5/13/chartex" xmlns:cx8="http://schemas.microsoft.com/office/drawing/2016/5/14/chartex" xmlns:mc="http://schemas.openxmlformats.org/markup-compatibility/2006" xmlns:aink="http://schemas.microsoft.com/office/drawing/2016/ink" xmlns:am3d="http://schemas.microsoft.com/office/drawing/2017/model3d" xmlns:o="urn:schemas-microsoft-com:office:office" xmlns:r="http://schemas.openxmlformats.org/officeDocument/2006/relationships" xmlns:m="http://schemas.openxmlformats.org/officeDocument/2006/math" xmlns:v="urn:schemas-microsoft-com:vml" xmlns:wp14="http://schemas.microsoft.com/office/word/2010/wordprocessingDrawing" xmlns:wp="http://schemas.openxmlformats.org/drawingml/2006/wordprocessingDrawing" xmlns:w10="urn:schemas-microsoft-com:office:word" xmlns:w="http://schemas.openxmlformats.org/wordprocessingml/2006/main" xmlns:w14="http://schemas.microsoft.com/office/word/2010/wordml" xmlns:w15="http://schemas.microsoft.com/office/word/2012/wordml" xmlns:w16cex="http://schemas.microsoft.com/office/word/2018/wordml/cex" xmlns:w16cid="http://schemas.microsoft.com/office/word/2016/wordml/cid" xmlns:w16="http://schemas.microsoft.com/office/word/2018/wordml" xmlns:w16sdtdh="http://schemas.microsoft.com/office/word/2020/wordml/sdtdatahash" xmlns:w16se="http://schemas.microsoft.com/office/word/2015/wordml/symex" xmlns:wpg="http://schemas.microsoft.com/office/word/2010/wordprocessingGroup" xmlns:wpi="http://schemas.microsoft.com/office/word/2010/wordprocessingInk" xmlns:wne="http://schemas.microsoft.com/office/word/2006/wordml" xmlns:wps="http://schemas.microsoft.com/office/word/2010/wordprocessingShape" mc:Ignorable="w14 w15 w16se w16cid w16 w16cex w16sdtdh wp14">
+<w:numbering xmlns:wpc="http://schemas.microsoft.com/office/word/2010/wordprocessingCanvas" xmlns:cx="http://schemas.microsoft.com/office/drawing/2014/chartex" xmlns:cx1="http://schemas.microsoft.com/office/drawing/2015/9/8/chartex" xmlns:cx2="http://schemas.microsoft.com/office/drawing/2015/10/21/chartex" xmlns:cx3="http://schemas.microsoft.com/office/drawing/2016/5/9/chartex" xmlns:cx4="http://schemas.microsoft.com/office/drawing/2016/5/10/chartex" xmlns:cx5="http://schemas.microsoft.com/office/drawing/2016/5/11/chartex" xmlns:cx6="http://schemas.microsoft.com/office/drawing/2016/5/12/chartex" xmlns:cx7="http://schemas.microsoft.com/office/drawing/2016/5/13/chartex" xmlns:cx8="http://schemas.microsoft.com/office/drawing/2016/5/14/chartex" xmlns:mc="http://schemas.openxmlformats.org/markup-compatibility/2006" xmlns:aink="http://schemas.microsoft.com/office/drawing/2016/ink" xmlns:am3d="http://schemas.microsoft.com/office/drawing/2017/model3d" xmlns:o="urn:schemas-microsoft-com:office:office" xmlns:oel="http://schemas.microsoft.com/office/2019/extlst" xmlns:r="http://schemas.openxmlformats.org/officeDocument/2006/relationships" xmlns:m="http://schemas.openxmlformats.org/officeDocument/2006/math" xmlns:v="urn:schemas-microsoft-com:vml" xmlns:wp14="http://schemas.microsoft.com/office/word/2010/wordprocessingDrawing" xmlns:wp="http://schemas.openxmlformats.org/drawingml/2006/wordprocessingDrawing" xmlns:w10="urn:schemas-microsoft-com:office:word" xmlns:w="http://schemas.openxmlformats.org/wordprocessingml/2006/main" xmlns:w14="http://schemas.microsoft.com/office/word/2010/wordml" xmlns:w15="http://schemas.microsoft.com/office/word/2012/wordml" xmlns:w16cex="http://schemas.microsoft.com/office/word/2018/wordml/cex" xmlns:w16cid="http://schemas.microsoft.com/office/word/2016/wordml/cid" xmlns:w16="http://schemas.microsoft.com/office/word/2018/wordml" xmlns:w16du="http://schemas.microsoft.com/office/word/2023/wordml/word16du" xmlns:w16sdtdh="http://schemas.microsoft.com/office/word/2020/wordml/sdtdatahash" xmlns:w16sdtfl="http://schemas.microsoft.com/office/word/2024/wordml/sdtformatlock" xmlns:w16se="http://schemas.microsoft.com/office/word/2015/wordml/symex" xmlns:wpg="http://schemas.microsoft.com/office/word/2010/wordprocessingGroup" xmlns:wpi="http://schemas.microsoft.com/office/word/2010/wordprocessingInk" xmlns:wne="http://schemas.microsoft.com/office/word/2006/wordml" xmlns:wps="http://schemas.microsoft.com/office/word/2010/wordprocessingShape" mc:Ignorable="w14 w15 w16se w16cid w16 w16cex w16sdtdh w16sdtfl w16du wp14">
   <w:abstractNum w:abstractNumId="0" w15:restartNumberingAfterBreak="0">
     <w:nsid w:val="D4DBA011"/>
     <w:multiLevelType w:val="singleLevel"/>
@@ -2120,7 +2117,7 @@
         <w:ind w:left="497" w:hanging="497"/>
       </w:pPr>
       <w:rPr>
-        <w:rFonts w:ascii="黑体" w:eastAsia="黑体" w:hAnsi="黑体" w:cs="黑体" w:hint="eastAsia"/>
+        <w:rFonts w:ascii="SimHei" w:eastAsia="SimHei" w:hAnsi="SimHei" w:cs="SimHei" w:hint="eastAsia"/>
         <w:b/>
         <w:sz w:val="24"/>
       </w:rPr>
@@ -2581,50 +2578,41 @@
       </w:rPr>
     </w:lvl>
   </w:abstractNum>
-  <w:num w:numId="1">
+  <w:num w:numId="1" w16cid:durableId="1906792475">
     <w:abstractNumId w:val="1"/>
-    <w:lvlOverride w:ilvl="0"/>
-    <w:lvlOverride w:ilvl="1"/>
-    <w:lvlOverride w:ilvl="2"/>
-    <w:lvlOverride w:ilvl="3"/>
-    <w:lvlOverride w:ilvl="4"/>
-    <w:lvlOverride w:ilvl="5"/>
-    <w:lvlOverride w:ilvl="6"/>
-    <w:lvlOverride w:ilvl="7"/>
-    <w:lvlOverride w:ilvl="8"/>
   </w:num>
-  <w:num w:numId="2">
+  <w:num w:numId="2" w16cid:durableId="1980572907">
     <w:abstractNumId w:val="0"/>
     <w:lvlOverride w:ilvl="0">
       <w:startOverride w:val="3"/>
     </w:lvlOverride>
   </w:num>
-  <w:num w:numId="3">
+  <w:num w:numId="3" w16cid:durableId="699622561">
     <w:abstractNumId w:val="5"/>
     <w:lvlOverride w:ilvl="0">
       <w:startOverride w:val="1"/>
     </w:lvlOverride>
   </w:num>
-  <w:num w:numId="4">
+  <w:num w:numId="4" w16cid:durableId="2123499483">
     <w:abstractNumId w:val="4"/>
   </w:num>
-  <w:num w:numId="5">
+  <w:num w:numId="5" w16cid:durableId="944769975">
     <w:abstractNumId w:val="6"/>
   </w:num>
-  <w:num w:numId="6">
+  <w:num w:numId="6" w16cid:durableId="346829975">
     <w:abstractNumId w:val="2"/>
   </w:num>
-  <w:num w:numId="7">
+  <w:num w:numId="7" w16cid:durableId="741291656">
     <w:abstractNumId w:val="7"/>
   </w:num>
-  <w:num w:numId="8">
+  <w:num w:numId="8" w16cid:durableId="1762409999">
     <w:abstractNumId w:val="3"/>
   </w:num>
 </w:numbering>
 </file>
 
 <file path=word/styles.xml><?xml version="1.0" encoding="utf-8"?>
-<w:styles xmlns:mc="http://schemas.openxmlformats.org/markup-compatibility/2006" xmlns:r="http://schemas.openxmlformats.org/officeDocument/2006/relationships" xmlns:w="http://schemas.openxmlformats.org/wordprocessingml/2006/main" xmlns:w14="http://schemas.microsoft.com/office/word/2010/wordml" xmlns:w15="http://schemas.microsoft.com/office/word/2012/wordml" xmlns:w16cex="http://schemas.microsoft.com/office/word/2018/wordml/cex" xmlns:w16cid="http://schemas.microsoft.com/office/word/2016/wordml/cid" xmlns:w16="http://schemas.microsoft.com/office/word/2018/wordml" xmlns:w16sdtdh="http://schemas.microsoft.com/office/word/2020/wordml/sdtdatahash" xmlns:w16se="http://schemas.microsoft.com/office/word/2015/wordml/symex" mc:Ignorable="w14 w15 w16se w16cid w16 w16cex w16sdtdh">
+<w:styles xmlns:mc="http://schemas.openxmlformats.org/markup-compatibility/2006" xmlns:r="http://schemas.openxmlformats.org/officeDocument/2006/relationships" xmlns:w="http://schemas.openxmlformats.org/wordprocessingml/2006/main" xmlns:w14="http://schemas.microsoft.com/office/word/2010/wordml" xmlns:w15="http://schemas.microsoft.com/office/word/2012/wordml" xmlns:w16cex="http://schemas.microsoft.com/office/word/2018/wordml/cex" xmlns:w16cid="http://schemas.microsoft.com/office/word/2016/wordml/cid" xmlns:w16="http://schemas.microsoft.com/office/word/2018/wordml" xmlns:w16du="http://schemas.microsoft.com/office/word/2023/wordml/word16du" xmlns:w16sdtdh="http://schemas.microsoft.com/office/word/2020/wordml/sdtdatahash" xmlns:w16sdtfl="http://schemas.microsoft.com/office/word/2024/wordml/sdtformatlock" xmlns:w16se="http://schemas.microsoft.com/office/word/2015/wordml/symex" mc:Ignorable="w14 w15 w16se w16cid w16 w16cex w16sdtdh w16sdtfl w16du">
   <w:docDefaults>
     <w:rPrDefault>
       <w:rPr>
@@ -3025,7 +3013,7 @@
       <w:jc w:val="both"/>
     </w:pPr>
     <w:rPr>
-      <w:rFonts w:ascii="Times New Roman" w:eastAsia="宋体" w:hAnsi="Times New Roman"/>
+      <w:rFonts w:ascii="Times New Roman" w:eastAsia="SimSun" w:hAnsi="Times New Roman"/>
       <w:sz w:val="24"/>
       <w:szCs w:val="24"/>
     </w:rPr>
@@ -3043,7 +3031,7 @@
       <w:outlineLvl w:val="0"/>
     </w:pPr>
     <w:rPr>
-      <w:rFonts w:ascii="宋体" w:hAnsi="宋体" w:cs="宋体"/>
+      <w:rFonts w:ascii="SimSun" w:hAnsi="SimSun" w:cs="SimSun"/>
       <w:b/>
       <w:bCs/>
       <w:kern w:val="44"/>
@@ -3054,6 +3042,7 @@
   <w:style w:type="character" w:default="1" w:styleId="a0">
     <w:name w:val="Default Paragraph Font"/>
     <w:uiPriority w:val="1"/>
+    <w:semiHidden/>
     <w:unhideWhenUsed/>
   </w:style>
   <w:style w:type="table" w:default="1" w:styleId="a1">
@@ -3083,7 +3072,7 @@
     <w:link w:val="1"/>
     <w:rsid w:val="00E65A31"/>
     <w:rPr>
-      <w:rFonts w:ascii="宋体" w:eastAsia="宋体" w:hAnsi="宋体" w:cs="宋体"/>
+      <w:rFonts w:ascii="SimSun" w:eastAsia="SimSun" w:hAnsi="SimSun" w:cs="SimSun"/>
       <w:b/>
       <w:bCs/>
       <w:kern w:val="44"/>
@@ -3111,7 +3100,7 @@
       <w:jc w:val="both"/>
     </w:pPr>
     <w:rPr>
-      <w:rFonts w:ascii="Times New Roman" w:eastAsia="宋体" w:hAnsi="Times New Roman" w:cs="Times New Roman"/>
+      <w:rFonts w:ascii="Times New Roman" w:eastAsia="SimSun" w:hAnsi="Times New Roman" w:cs="Times New Roman"/>
       <w:kern w:val="0"/>
       <w:sz w:val="20"/>
       <w:szCs w:val="20"/>
@@ -3141,7 +3130,7 @@
       <w:jc w:val="left"/>
     </w:pPr>
     <w:rPr>
-      <w:rFonts w:ascii="宋体" w:hAnsi="宋体" w:cs="宋体"/>
+      <w:rFonts w:ascii="SimSun" w:hAnsi="SimSun" w:cs="SimSun"/>
       <w:kern w:val="0"/>
     </w:rPr>
   </w:style>

</xml_diff>